<commit_message>
Publish workspace from pulse-cluster @ c4c3c46
Page built with --flat so pdf/ and the Markdown sources resolve from the
site root. Assets refreshed alongside it.
</commit_message>
<xml_diff>
--- a/pdf/PULSE-RTM-001_Traceability_Matrix.docx
+++ b/pdf/PULSE-RTM-001_Traceability_Matrix.docx
@@ -1679,6 +1679,18 @@
                 <w:rStyle w:val="VerbatimChar"/>
               </w:rPr>
               <w:t xml:space="preserve">vss/dms_vss_overlay.vspec</w:t>
+            </w:r>
+            <w:r>
+              <w:t xml:space="preserve">,</w:t>
+            </w:r>
+            <w:r>
+              <w:t xml:space="preserve"> </w:t>
+            </w:r>
+            <w:r>
+              <w:rPr>
+                <w:rStyle w:val="VerbatimChar"/>
+              </w:rPr>
+              <w:t xml:space="preserve">vss/pulse_can_overlay.vspec</w:t>
             </w:r>
             <w:r>
               <w:t xml:space="preserve">; upstream spec consumed unmodified</w:t>

</xml_diff>